<commit_message>
Aggiorna il valore quota da 30,33 a 30,75 nei modelli del Portale Soci
Rivalutazione delle quote: il valore nominale dell'azione passa da
30,33 a 30,75 euro nei modelli generati dal portale.

PHP (logica di calcolo):
- SO01 Cessione a Banca da PF
- SO02 Cessione a Banca da PG
- SO09 Designazione erede
- SO50 Addendum donazione
- SO51 Addendum rateizzazione (ricalcolati anche gli importi
  derivati: ulteriori azioni a 30,75; prime azioni a 31,75 con
  sovrapprezzo 1,00 invariato; U30 92,25/95,25, CM 246,00/254,00)
- SO52 Addendum ulteriori quote

Template PDF + sorgenti DOCX (testo statico del modulo):
- SO50, SO51, SO52 aggiornati a 30,75 (SO52 anche "TRENTA/75")

Co-Authored-By: Claude Opus 4.8 (1M context) <noreply@anthropic.com>
</commit_message>
<xml_diff>
--- a/modulistica/SO50_addendum_donazione.docx
+++ b/modulistica/SO50_addendum_donazione.docx
@@ -1,6 +1,6 @@
 
 <file path=word/document.xml><?xml version="1.0" encoding="utf-8"?>
-<w:document xmlns:wpc="http://schemas.microsoft.com/office/word/2010/wordprocessingCanvas" xmlns:cx="http://schemas.microsoft.com/office/drawing/2014/chartex" xmlns:cx1="http://schemas.microsoft.com/office/drawing/2015/9/8/chartex" xmlns:cx2="http://schemas.microsoft.com/office/drawing/2015/10/21/chartex" xmlns:cx3="http://schemas.microsoft.com/office/drawing/2016/5/9/chartex" xmlns:cx4="http://schemas.microsoft.com/office/drawing/2016/5/10/chartex" xmlns:cx5="http://schemas.microsoft.com/office/drawing/2016/5/11/chartex" xmlns:cx6="http://schemas.microsoft.com/office/drawing/2016/5/12/chartex" xmlns:cx7="http://schemas.microsoft.com/office/drawing/2016/5/13/chartex" xmlns:cx8="http://schemas.microsoft.com/office/drawing/2016/5/14/chartex" xmlns:mc="http://schemas.openxmlformats.org/markup-compatibility/2006" xmlns:aink="http://schemas.microsoft.com/office/drawing/2016/ink" xmlns:am3d="http://schemas.microsoft.com/office/drawing/2017/model3d" xmlns:o="urn:schemas-microsoft-com:office:office" xmlns:oel="http://schemas.microsoft.com/office/2019/extlst" xmlns:r="http://schemas.openxmlformats.org/officeDocument/2006/relationships" xmlns:m="http://schemas.openxmlformats.org/officeDocument/2006/math" xmlns:v="urn:schemas-microsoft-com:vml" xmlns:wp14="http://schemas.microsoft.com/office/word/2010/wordprocessingDrawing" xmlns:wp="http://schemas.openxmlformats.org/drawingml/2006/wordprocessingDrawing" xmlns:w10="urn:schemas-microsoft-com:office:word" xmlns:w="http://schemas.openxmlformats.org/wordprocessingml/2006/main" xmlns:w14="http://schemas.microsoft.com/office/word/2010/wordml" xmlns:w15="http://schemas.microsoft.com/office/word/2012/wordml" xmlns:w16cex="http://schemas.microsoft.com/office/word/2018/wordml/cex" xmlns:w16cid="http://schemas.microsoft.com/office/word/2016/wordml/cid" xmlns:w16="http://schemas.microsoft.com/office/word/2018/wordml" xmlns:w16du="http://schemas.microsoft.com/office/word/2023/wordml/word16du" xmlns:w16sdtdh="http://schemas.microsoft.com/office/word/2020/wordml/sdtdatahash" xmlns:w16se="http://schemas.microsoft.com/office/word/2015/wordml/symex" xmlns:wpg="http://schemas.microsoft.com/office/word/2010/wordprocessingGroup" xmlns:wpi="http://schemas.microsoft.com/office/word/2010/wordprocessingInk" xmlns:wne="http://schemas.microsoft.com/office/word/2006/wordml" xmlns:wps="http://schemas.microsoft.com/office/word/2010/wordprocessingShape" mc:Ignorable="w14 w15 w16se w16cid w16 w16cex w16sdtdh w16du wp14">
+<w:document xmlns:wpc="http://schemas.microsoft.com/office/word/2010/wordprocessingCanvas" xmlns:cx="http://schemas.microsoft.com/office/drawing/2014/chartex" xmlns:cx1="http://schemas.microsoft.com/office/drawing/2015/9/8/chartex" xmlns:cx2="http://schemas.microsoft.com/office/drawing/2015/10/21/chartex" xmlns:cx3="http://schemas.microsoft.com/office/drawing/2016/5/9/chartex" xmlns:cx4="http://schemas.microsoft.com/office/drawing/2016/5/10/chartex" xmlns:cx5="http://schemas.microsoft.com/office/drawing/2016/5/11/chartex" xmlns:cx6="http://schemas.microsoft.com/office/drawing/2016/5/12/chartex" xmlns:cx7="http://schemas.microsoft.com/office/drawing/2016/5/13/chartex" xmlns:cx8="http://schemas.microsoft.com/office/drawing/2016/5/14/chartex" xmlns:mc="http://schemas.openxmlformats.org/markup-compatibility/2006" xmlns:aink="http://schemas.microsoft.com/office/drawing/2016/ink" xmlns:am3d="http://schemas.microsoft.com/office/drawing/2017/model3d" xmlns:o="urn:schemas-microsoft-com:office:office" xmlns:oel="http://schemas.microsoft.com/office/2019/extlst" xmlns:r="http://schemas.openxmlformats.org/officeDocument/2006/relationships" xmlns:m="http://schemas.openxmlformats.org/officeDocument/2006/math" xmlns:v="urn:schemas-microsoft-com:vml" xmlns:wp14="http://schemas.microsoft.com/office/word/2010/wordprocessingDrawing" xmlns:wp="http://schemas.openxmlformats.org/drawingml/2006/wordprocessingDrawing" xmlns:w10="urn:schemas-microsoft-com:office:word" xmlns:w="http://schemas.openxmlformats.org/wordprocessingml/2006/main" xmlns:w14="http://schemas.microsoft.com/office/word/2010/wordml" xmlns:w15="http://schemas.microsoft.com/office/word/2012/wordml" xmlns:w16cex="http://schemas.microsoft.com/office/word/2018/wordml/cex" xmlns:w16cid="http://schemas.microsoft.com/office/word/2016/wordml/cid" xmlns:w16="http://schemas.microsoft.com/office/word/2018/wordml" xmlns:w16du="http://schemas.microsoft.com/office/word/2023/wordml/word16du" xmlns:w16sdtdh="http://schemas.microsoft.com/office/word/2020/wordml/sdtdatahash" xmlns:w16sdtfl="http://schemas.microsoft.com/office/word/2024/wordml/sdtformatlock" xmlns:w16se="http://schemas.microsoft.com/office/word/2015/wordml/symex" xmlns:wpg="http://schemas.microsoft.com/office/word/2010/wordprocessingGroup" xmlns:wpi="http://schemas.microsoft.com/office/word/2010/wordprocessingInk" xmlns:wne="http://schemas.microsoft.com/office/word/2006/wordml" xmlns:wps="http://schemas.microsoft.com/office/word/2010/wordprocessingShape" mc:Ignorable="w14 w15 w16se w16cid w16 w16cex w16sdtdh w16sdtfl w16du wp14">
   <w:body>
     <w:p>
       <w:pPr>
@@ -393,7 +393,7 @@
           <w:sz w:val="20"/>
           <w:szCs w:val="20"/>
         </w:rPr>
-        <w:t>33</w:t>
+        <w:t>75</w:t>
       </w:r>
       <w:r>
         <w:rPr>
@@ -602,7 +602,7 @@
           <w:sz w:val="20"/>
           <w:szCs w:val="20"/>
         </w:rPr>
-        <w:t>33</w:t>
+        <w:t>75</w:t>
       </w:r>
       <w:r>
         <w:rPr>
@@ -771,7 +771,6 @@
         <w:tc>
           <w:tcPr>
             <w:tcW w:w="4469" w:type="dxa"/>
-            <w:shd w:val="clear" w:color="auto" w:fill="auto"/>
           </w:tcPr>
           <w:p>
             <w:pPr>
@@ -823,7 +822,6 @@
         <w:tc>
           <w:tcPr>
             <w:tcW w:w="5169" w:type="dxa"/>
-            <w:shd w:val="clear" w:color="auto" w:fill="auto"/>
           </w:tcPr>
           <w:p>
             <w:pPr>
@@ -892,7 +890,7 @@
 </file>
 
 <file path=word/endnotes.xml><?xml version="1.0" encoding="utf-8"?>
-<w:endnotes xmlns:wpc="http://schemas.microsoft.com/office/word/2010/wordprocessingCanvas" xmlns:cx="http://schemas.microsoft.com/office/drawing/2014/chartex" xmlns:cx1="http://schemas.microsoft.com/office/drawing/2015/9/8/chartex" xmlns:cx2="http://schemas.microsoft.com/office/drawing/2015/10/21/chartex" xmlns:cx3="http://schemas.microsoft.com/office/drawing/2016/5/9/chartex" xmlns:cx4="http://schemas.microsoft.com/office/drawing/2016/5/10/chartex" xmlns:cx5="http://schemas.microsoft.com/office/drawing/2016/5/11/chartex" xmlns:cx6="http://schemas.microsoft.com/office/drawing/2016/5/12/chartex" xmlns:cx7="http://schemas.microsoft.com/office/drawing/2016/5/13/chartex" xmlns:cx8="http://schemas.microsoft.com/office/drawing/2016/5/14/chartex" xmlns:mc="http://schemas.openxmlformats.org/markup-compatibility/2006" xmlns:aink="http://schemas.microsoft.com/office/drawing/2016/ink" xmlns:am3d="http://schemas.microsoft.com/office/drawing/2017/model3d" xmlns:o="urn:schemas-microsoft-com:office:office" xmlns:oel="http://schemas.microsoft.com/office/2019/extlst" xmlns:r="http://schemas.openxmlformats.org/officeDocument/2006/relationships" xmlns:m="http://schemas.openxmlformats.org/officeDocument/2006/math" xmlns:v="urn:schemas-microsoft-com:vml" xmlns:wp14="http://schemas.microsoft.com/office/word/2010/wordprocessingDrawing" xmlns:wp="http://schemas.openxmlformats.org/drawingml/2006/wordprocessingDrawing" xmlns:w10="urn:schemas-microsoft-com:office:word" xmlns:w="http://schemas.openxmlformats.org/wordprocessingml/2006/main" xmlns:w14="http://schemas.microsoft.com/office/word/2010/wordml" xmlns:w15="http://schemas.microsoft.com/office/word/2012/wordml" xmlns:w16cex="http://schemas.microsoft.com/office/word/2018/wordml/cex" xmlns:w16cid="http://schemas.microsoft.com/office/word/2016/wordml/cid" xmlns:w16="http://schemas.microsoft.com/office/word/2018/wordml" xmlns:w16du="http://schemas.microsoft.com/office/word/2023/wordml/word16du" xmlns:w16sdtdh="http://schemas.microsoft.com/office/word/2020/wordml/sdtdatahash" xmlns:w16se="http://schemas.microsoft.com/office/word/2015/wordml/symex" xmlns:wpg="http://schemas.microsoft.com/office/word/2010/wordprocessingGroup" xmlns:wpi="http://schemas.microsoft.com/office/word/2010/wordprocessingInk" xmlns:wne="http://schemas.microsoft.com/office/word/2006/wordml" xmlns:wps="http://schemas.microsoft.com/office/word/2010/wordprocessingShape" mc:Ignorable="w14 w15 w16se w16cid w16 w16cex w16sdtdh w16du wp14">
+<w:endnotes xmlns:wpc="http://schemas.microsoft.com/office/word/2010/wordprocessingCanvas" xmlns:cx="http://schemas.microsoft.com/office/drawing/2014/chartex" xmlns:cx1="http://schemas.microsoft.com/office/drawing/2015/9/8/chartex" xmlns:cx2="http://schemas.microsoft.com/office/drawing/2015/10/21/chartex" xmlns:cx3="http://schemas.microsoft.com/office/drawing/2016/5/9/chartex" xmlns:cx4="http://schemas.microsoft.com/office/drawing/2016/5/10/chartex" xmlns:cx5="http://schemas.microsoft.com/office/drawing/2016/5/11/chartex" xmlns:cx6="http://schemas.microsoft.com/office/drawing/2016/5/12/chartex" xmlns:cx7="http://schemas.microsoft.com/office/drawing/2016/5/13/chartex" xmlns:cx8="http://schemas.microsoft.com/office/drawing/2016/5/14/chartex" xmlns:mc="http://schemas.openxmlformats.org/markup-compatibility/2006" xmlns:aink="http://schemas.microsoft.com/office/drawing/2016/ink" xmlns:am3d="http://schemas.microsoft.com/office/drawing/2017/model3d" xmlns:o="urn:schemas-microsoft-com:office:office" xmlns:oel="http://schemas.microsoft.com/office/2019/extlst" xmlns:r="http://schemas.openxmlformats.org/officeDocument/2006/relationships" xmlns:m="http://schemas.openxmlformats.org/officeDocument/2006/math" xmlns:v="urn:schemas-microsoft-com:vml" xmlns:wp14="http://schemas.microsoft.com/office/word/2010/wordprocessingDrawing" xmlns:wp="http://schemas.openxmlformats.org/drawingml/2006/wordprocessingDrawing" xmlns:w10="urn:schemas-microsoft-com:office:word" xmlns:w="http://schemas.openxmlformats.org/wordprocessingml/2006/main" xmlns:w14="http://schemas.microsoft.com/office/word/2010/wordml" xmlns:w15="http://schemas.microsoft.com/office/word/2012/wordml" xmlns:w16cex="http://schemas.microsoft.com/office/word/2018/wordml/cex" xmlns:w16cid="http://schemas.microsoft.com/office/word/2016/wordml/cid" xmlns:w16="http://schemas.microsoft.com/office/word/2018/wordml" xmlns:w16du="http://schemas.microsoft.com/office/word/2023/wordml/word16du" xmlns:w16sdtdh="http://schemas.microsoft.com/office/word/2020/wordml/sdtdatahash" xmlns:w16sdtfl="http://schemas.microsoft.com/office/word/2024/wordml/sdtformatlock" xmlns:w16se="http://schemas.microsoft.com/office/word/2015/wordml/symex" xmlns:wpg="http://schemas.microsoft.com/office/word/2010/wordprocessingGroup" xmlns:wpi="http://schemas.microsoft.com/office/word/2010/wordprocessingInk" xmlns:wne="http://schemas.microsoft.com/office/word/2006/wordml" xmlns:wps="http://schemas.microsoft.com/office/word/2010/wordprocessingShape" mc:Ignorable="w14 w15 w16se w16cid w16 w16cex w16sdtdh w16sdtfl w16du wp14">
   <w:endnote w:type="separator" w:id="-1">
     <w:p>
       <w:pPr>
@@ -917,7 +915,7 @@
 </file>
 
 <file path=word/footer1.xml><?xml version="1.0" encoding="utf-8"?>
-<w:ftr xmlns:wpc="http://schemas.microsoft.com/office/word/2010/wordprocessingCanvas" xmlns:cx="http://schemas.microsoft.com/office/drawing/2014/chartex" xmlns:cx1="http://schemas.microsoft.com/office/drawing/2015/9/8/chartex" xmlns:cx2="http://schemas.microsoft.com/office/drawing/2015/10/21/chartex" xmlns:cx3="http://schemas.microsoft.com/office/drawing/2016/5/9/chartex" xmlns:cx4="http://schemas.microsoft.com/office/drawing/2016/5/10/chartex" xmlns:cx5="http://schemas.microsoft.com/office/drawing/2016/5/11/chartex" xmlns:cx6="http://schemas.microsoft.com/office/drawing/2016/5/12/chartex" xmlns:cx7="http://schemas.microsoft.com/office/drawing/2016/5/13/chartex" xmlns:cx8="http://schemas.microsoft.com/office/drawing/2016/5/14/chartex" xmlns:mc="http://schemas.openxmlformats.org/markup-compatibility/2006" xmlns:aink="http://schemas.microsoft.com/office/drawing/2016/ink" xmlns:am3d="http://schemas.microsoft.com/office/drawing/2017/model3d" xmlns:o="urn:schemas-microsoft-com:office:office" xmlns:oel="http://schemas.microsoft.com/office/2019/extlst" xmlns:r="http://schemas.openxmlformats.org/officeDocument/2006/relationships" xmlns:m="http://schemas.openxmlformats.org/officeDocument/2006/math" xmlns:v="urn:schemas-microsoft-com:vml" xmlns:wp14="http://schemas.microsoft.com/office/word/2010/wordprocessingDrawing" xmlns:wp="http://schemas.openxmlformats.org/drawingml/2006/wordprocessingDrawing" xmlns:w10="urn:schemas-microsoft-com:office:word" xmlns:w="http://schemas.openxmlformats.org/wordprocessingml/2006/main" xmlns:w14="http://schemas.microsoft.com/office/word/2010/wordml" xmlns:w15="http://schemas.microsoft.com/office/word/2012/wordml" xmlns:w16cex="http://schemas.microsoft.com/office/word/2018/wordml/cex" xmlns:w16cid="http://schemas.microsoft.com/office/word/2016/wordml/cid" xmlns:w16="http://schemas.microsoft.com/office/word/2018/wordml" xmlns:w16du="http://schemas.microsoft.com/office/word/2023/wordml/word16du" xmlns:w16sdtdh="http://schemas.microsoft.com/office/word/2020/wordml/sdtdatahash" xmlns:w16se="http://schemas.microsoft.com/office/word/2015/wordml/symex" xmlns:wpg="http://schemas.microsoft.com/office/word/2010/wordprocessingGroup" xmlns:wpi="http://schemas.microsoft.com/office/word/2010/wordprocessingInk" xmlns:wne="http://schemas.microsoft.com/office/word/2006/wordml" xmlns:wps="http://schemas.microsoft.com/office/word/2010/wordprocessingShape" mc:Ignorable="w14 w15 w16se w16cid w16 w16cex w16sdtdh w16du wp14">
+<w:ftr xmlns:wpc="http://schemas.microsoft.com/office/word/2010/wordprocessingCanvas" xmlns:cx="http://schemas.microsoft.com/office/drawing/2014/chartex" xmlns:cx1="http://schemas.microsoft.com/office/drawing/2015/9/8/chartex" xmlns:cx2="http://schemas.microsoft.com/office/drawing/2015/10/21/chartex" xmlns:cx3="http://schemas.microsoft.com/office/drawing/2016/5/9/chartex" xmlns:cx4="http://schemas.microsoft.com/office/drawing/2016/5/10/chartex" xmlns:cx5="http://schemas.microsoft.com/office/drawing/2016/5/11/chartex" xmlns:cx6="http://schemas.microsoft.com/office/drawing/2016/5/12/chartex" xmlns:cx7="http://schemas.microsoft.com/office/drawing/2016/5/13/chartex" xmlns:cx8="http://schemas.microsoft.com/office/drawing/2016/5/14/chartex" xmlns:mc="http://schemas.openxmlformats.org/markup-compatibility/2006" xmlns:aink="http://schemas.microsoft.com/office/drawing/2016/ink" xmlns:am3d="http://schemas.microsoft.com/office/drawing/2017/model3d" xmlns:o="urn:schemas-microsoft-com:office:office" xmlns:oel="http://schemas.microsoft.com/office/2019/extlst" xmlns:r="http://schemas.openxmlformats.org/officeDocument/2006/relationships" xmlns:m="http://schemas.openxmlformats.org/officeDocument/2006/math" xmlns:v="urn:schemas-microsoft-com:vml" xmlns:wp14="http://schemas.microsoft.com/office/word/2010/wordprocessingDrawing" xmlns:wp="http://schemas.openxmlformats.org/drawingml/2006/wordprocessingDrawing" xmlns:w10="urn:schemas-microsoft-com:office:word" xmlns:w="http://schemas.openxmlformats.org/wordprocessingml/2006/main" xmlns:w14="http://schemas.microsoft.com/office/word/2010/wordml" xmlns:w15="http://schemas.microsoft.com/office/word/2012/wordml" xmlns:w16cex="http://schemas.microsoft.com/office/word/2018/wordml/cex" xmlns:w16cid="http://schemas.microsoft.com/office/word/2016/wordml/cid" xmlns:w16="http://schemas.microsoft.com/office/word/2018/wordml" xmlns:w16du="http://schemas.microsoft.com/office/word/2023/wordml/word16du" xmlns:w16sdtdh="http://schemas.microsoft.com/office/word/2020/wordml/sdtdatahash" xmlns:w16sdtfl="http://schemas.microsoft.com/office/word/2024/wordml/sdtformatlock" xmlns:w16se="http://schemas.microsoft.com/office/word/2015/wordml/symex" xmlns:wpg="http://schemas.microsoft.com/office/word/2010/wordprocessingGroup" xmlns:wpi="http://schemas.microsoft.com/office/word/2010/wordprocessingInk" xmlns:wne="http://schemas.microsoft.com/office/word/2006/wordml" xmlns:wps="http://schemas.microsoft.com/office/word/2010/wordprocessingShape" mc:Ignorable="w14 w15 w16se w16cid w16 w16cex w16sdtdh w16sdtfl w16du wp14">
   <w:p>
     <w:pPr>
       <w:pStyle w:val="Pidipagina"/>
@@ -942,7 +940,7 @@
 </file>
 
 <file path=word/footnotes.xml><?xml version="1.0" encoding="utf-8"?>
-<w:footnotes xmlns:wpc="http://schemas.microsoft.com/office/word/2010/wordprocessingCanvas" xmlns:cx="http://schemas.microsoft.com/office/drawing/2014/chartex" xmlns:cx1="http://schemas.microsoft.com/office/drawing/2015/9/8/chartex" xmlns:cx2="http://schemas.microsoft.com/office/drawing/2015/10/21/chartex" xmlns:cx3="http://schemas.microsoft.com/office/drawing/2016/5/9/chartex" xmlns:cx4="http://schemas.microsoft.com/office/drawing/2016/5/10/chartex" xmlns:cx5="http://schemas.microsoft.com/office/drawing/2016/5/11/chartex" xmlns:cx6="http://schemas.microsoft.com/office/drawing/2016/5/12/chartex" xmlns:cx7="http://schemas.microsoft.com/office/drawing/2016/5/13/chartex" xmlns:cx8="http://schemas.microsoft.com/office/drawing/2016/5/14/chartex" xmlns:mc="http://schemas.openxmlformats.org/markup-compatibility/2006" xmlns:aink="http://schemas.microsoft.com/office/drawing/2016/ink" xmlns:am3d="http://schemas.microsoft.com/office/drawing/2017/model3d" xmlns:o="urn:schemas-microsoft-com:office:office" xmlns:oel="http://schemas.microsoft.com/office/2019/extlst" xmlns:r="http://schemas.openxmlformats.org/officeDocument/2006/relationships" xmlns:m="http://schemas.openxmlformats.org/officeDocument/2006/math" xmlns:v="urn:schemas-microsoft-com:vml" xmlns:wp14="http://schemas.microsoft.com/office/word/2010/wordprocessingDrawing" xmlns:wp="http://schemas.openxmlformats.org/drawingml/2006/wordprocessingDrawing" xmlns:w10="urn:schemas-microsoft-com:office:word" xmlns:w="http://schemas.openxmlformats.org/wordprocessingml/2006/main" xmlns:w14="http://schemas.microsoft.com/office/word/2010/wordml" xmlns:w15="http://schemas.microsoft.com/office/word/2012/wordml" xmlns:w16cex="http://schemas.microsoft.com/office/word/2018/wordml/cex" xmlns:w16cid="http://schemas.microsoft.com/office/word/2016/wordml/cid" xmlns:w16="http://schemas.microsoft.com/office/word/2018/wordml" xmlns:w16du="http://schemas.microsoft.com/office/word/2023/wordml/word16du" xmlns:w16sdtdh="http://schemas.microsoft.com/office/word/2020/wordml/sdtdatahash" xmlns:w16se="http://schemas.microsoft.com/office/word/2015/wordml/symex" xmlns:wpg="http://schemas.microsoft.com/office/word/2010/wordprocessingGroup" xmlns:wpi="http://schemas.microsoft.com/office/word/2010/wordprocessingInk" xmlns:wne="http://schemas.microsoft.com/office/word/2006/wordml" xmlns:wps="http://schemas.microsoft.com/office/word/2010/wordprocessingShape" mc:Ignorable="w14 w15 w16se w16cid w16 w16cex w16sdtdh w16du wp14">
+<w:footnotes xmlns:wpc="http://schemas.microsoft.com/office/word/2010/wordprocessingCanvas" xmlns:cx="http://schemas.microsoft.com/office/drawing/2014/chartex" xmlns:cx1="http://schemas.microsoft.com/office/drawing/2015/9/8/chartex" xmlns:cx2="http://schemas.microsoft.com/office/drawing/2015/10/21/chartex" xmlns:cx3="http://schemas.microsoft.com/office/drawing/2016/5/9/chartex" xmlns:cx4="http://schemas.microsoft.com/office/drawing/2016/5/10/chartex" xmlns:cx5="http://schemas.microsoft.com/office/drawing/2016/5/11/chartex" xmlns:cx6="http://schemas.microsoft.com/office/drawing/2016/5/12/chartex" xmlns:cx7="http://schemas.microsoft.com/office/drawing/2016/5/13/chartex" xmlns:cx8="http://schemas.microsoft.com/office/drawing/2016/5/14/chartex" xmlns:mc="http://schemas.openxmlformats.org/markup-compatibility/2006" xmlns:aink="http://schemas.microsoft.com/office/drawing/2016/ink" xmlns:am3d="http://schemas.microsoft.com/office/drawing/2017/model3d" xmlns:o="urn:schemas-microsoft-com:office:office" xmlns:oel="http://schemas.microsoft.com/office/2019/extlst" xmlns:r="http://schemas.openxmlformats.org/officeDocument/2006/relationships" xmlns:m="http://schemas.openxmlformats.org/officeDocument/2006/math" xmlns:v="urn:schemas-microsoft-com:vml" xmlns:wp14="http://schemas.microsoft.com/office/word/2010/wordprocessingDrawing" xmlns:wp="http://schemas.openxmlformats.org/drawingml/2006/wordprocessingDrawing" xmlns:w10="urn:schemas-microsoft-com:office:word" xmlns:w="http://schemas.openxmlformats.org/wordprocessingml/2006/main" xmlns:w14="http://schemas.microsoft.com/office/word/2010/wordml" xmlns:w15="http://schemas.microsoft.com/office/word/2012/wordml" xmlns:w16cex="http://schemas.microsoft.com/office/word/2018/wordml/cex" xmlns:w16cid="http://schemas.microsoft.com/office/word/2016/wordml/cid" xmlns:w16="http://schemas.microsoft.com/office/word/2018/wordml" xmlns:w16du="http://schemas.microsoft.com/office/word/2023/wordml/word16du" xmlns:w16sdtdh="http://schemas.microsoft.com/office/word/2020/wordml/sdtdatahash" xmlns:w16sdtfl="http://schemas.microsoft.com/office/word/2024/wordml/sdtformatlock" xmlns:w16se="http://schemas.microsoft.com/office/word/2015/wordml/symex" xmlns:wpg="http://schemas.microsoft.com/office/word/2010/wordprocessingGroup" xmlns:wpi="http://schemas.microsoft.com/office/word/2010/wordprocessingInk" xmlns:wne="http://schemas.microsoft.com/office/word/2006/wordml" xmlns:wps="http://schemas.microsoft.com/office/word/2010/wordprocessingShape" mc:Ignorable="w14 w15 w16se w16cid w16 w16cex w16sdtdh w16sdtfl w16du wp14">
   <w:footnote w:type="separator" w:id="-1">
     <w:p>
       <w:pPr>
@@ -967,7 +965,7 @@
 </file>
 
 <file path=word/header1.xml><?xml version="1.0" encoding="utf-8"?>
-<w:hdr xmlns:wpc="http://schemas.microsoft.com/office/word/2010/wordprocessingCanvas" xmlns:cx="http://schemas.microsoft.com/office/drawing/2014/chartex" xmlns:cx1="http://schemas.microsoft.com/office/drawing/2015/9/8/chartex" xmlns:cx2="http://schemas.microsoft.com/office/drawing/2015/10/21/chartex" xmlns:cx3="http://schemas.microsoft.com/office/drawing/2016/5/9/chartex" xmlns:cx4="http://schemas.microsoft.com/office/drawing/2016/5/10/chartex" xmlns:cx5="http://schemas.microsoft.com/office/drawing/2016/5/11/chartex" xmlns:cx6="http://schemas.microsoft.com/office/drawing/2016/5/12/chartex" xmlns:cx7="http://schemas.microsoft.com/office/drawing/2016/5/13/chartex" xmlns:cx8="http://schemas.microsoft.com/office/drawing/2016/5/14/chartex" xmlns:mc="http://schemas.openxmlformats.org/markup-compatibility/2006" xmlns:aink="http://schemas.microsoft.com/office/drawing/2016/ink" xmlns:am3d="http://schemas.microsoft.com/office/drawing/2017/model3d" xmlns:o="urn:schemas-microsoft-com:office:office" xmlns:oel="http://schemas.microsoft.com/office/2019/extlst" xmlns:r="http://schemas.openxmlformats.org/officeDocument/2006/relationships" xmlns:m="http://schemas.openxmlformats.org/officeDocument/2006/math" xmlns:v="urn:schemas-microsoft-com:vml" xmlns:wp14="http://schemas.microsoft.com/office/word/2010/wordprocessingDrawing" xmlns:wp="http://schemas.openxmlformats.org/drawingml/2006/wordprocessingDrawing" xmlns:w10="urn:schemas-microsoft-com:office:word" xmlns:w="http://schemas.openxmlformats.org/wordprocessingml/2006/main" xmlns:w14="http://schemas.microsoft.com/office/word/2010/wordml" xmlns:w15="http://schemas.microsoft.com/office/word/2012/wordml" xmlns:w16cex="http://schemas.microsoft.com/office/word/2018/wordml/cex" xmlns:w16cid="http://schemas.microsoft.com/office/word/2016/wordml/cid" xmlns:w16="http://schemas.microsoft.com/office/word/2018/wordml" xmlns:w16du="http://schemas.microsoft.com/office/word/2023/wordml/word16du" xmlns:w16sdtdh="http://schemas.microsoft.com/office/word/2020/wordml/sdtdatahash" xmlns:w16se="http://schemas.microsoft.com/office/word/2015/wordml/symex" xmlns:wpg="http://schemas.microsoft.com/office/word/2010/wordprocessingGroup" xmlns:wpi="http://schemas.microsoft.com/office/word/2010/wordprocessingInk" xmlns:wne="http://schemas.microsoft.com/office/word/2006/wordml" xmlns:wps="http://schemas.microsoft.com/office/word/2010/wordprocessingShape" mc:Ignorable="w14 w15 w16se w16cid w16 w16cex w16sdtdh w16du wp14">
+<w:hdr xmlns:wpc="http://schemas.microsoft.com/office/word/2010/wordprocessingCanvas" xmlns:cx="http://schemas.microsoft.com/office/drawing/2014/chartex" xmlns:cx1="http://schemas.microsoft.com/office/drawing/2015/9/8/chartex" xmlns:cx2="http://schemas.microsoft.com/office/drawing/2015/10/21/chartex" xmlns:cx3="http://schemas.microsoft.com/office/drawing/2016/5/9/chartex" xmlns:cx4="http://schemas.microsoft.com/office/drawing/2016/5/10/chartex" xmlns:cx5="http://schemas.microsoft.com/office/drawing/2016/5/11/chartex" xmlns:cx6="http://schemas.microsoft.com/office/drawing/2016/5/12/chartex" xmlns:cx7="http://schemas.microsoft.com/office/drawing/2016/5/13/chartex" xmlns:cx8="http://schemas.microsoft.com/office/drawing/2016/5/14/chartex" xmlns:mc="http://schemas.openxmlformats.org/markup-compatibility/2006" xmlns:aink="http://schemas.microsoft.com/office/drawing/2016/ink" xmlns:am3d="http://schemas.microsoft.com/office/drawing/2017/model3d" xmlns:o="urn:schemas-microsoft-com:office:office" xmlns:oel="http://schemas.microsoft.com/office/2019/extlst" xmlns:r="http://schemas.openxmlformats.org/officeDocument/2006/relationships" xmlns:m="http://schemas.openxmlformats.org/officeDocument/2006/math" xmlns:v="urn:schemas-microsoft-com:vml" xmlns:wp14="http://schemas.microsoft.com/office/word/2010/wordprocessingDrawing" xmlns:wp="http://schemas.openxmlformats.org/drawingml/2006/wordprocessingDrawing" xmlns:w10="urn:schemas-microsoft-com:office:word" xmlns:w="http://schemas.openxmlformats.org/wordprocessingml/2006/main" xmlns:w14="http://schemas.microsoft.com/office/word/2010/wordml" xmlns:w15="http://schemas.microsoft.com/office/word/2012/wordml" xmlns:w16cex="http://schemas.microsoft.com/office/word/2018/wordml/cex" xmlns:w16cid="http://schemas.microsoft.com/office/word/2016/wordml/cid" xmlns:w16="http://schemas.microsoft.com/office/word/2018/wordml" xmlns:w16du="http://schemas.microsoft.com/office/word/2023/wordml/word16du" xmlns:w16sdtdh="http://schemas.microsoft.com/office/word/2020/wordml/sdtdatahash" xmlns:w16sdtfl="http://schemas.microsoft.com/office/word/2024/wordml/sdtformatlock" xmlns:w16se="http://schemas.microsoft.com/office/word/2015/wordml/symex" xmlns:wpg="http://schemas.microsoft.com/office/word/2010/wordprocessingGroup" xmlns:wpi="http://schemas.microsoft.com/office/word/2010/wordprocessingInk" xmlns:wne="http://schemas.microsoft.com/office/word/2006/wordml" xmlns:wps="http://schemas.microsoft.com/office/word/2010/wordprocessingShape" mc:Ignorable="w14 w15 w16se w16cid w16 w16cex w16sdtdh w16sdtfl w16du wp14">
   <w:tbl>
     <w:tblPr>
       <w:tblStyle w:val="Grigliatabella"/>
@@ -1093,7 +1091,7 @@
 </file>
 
 <file path=word/numbering.xml><?xml version="1.0" encoding="utf-8"?>
-<w:numbering xmlns:wpc="http://schemas.microsoft.com/office/word/2010/wordprocessingCanvas" xmlns:cx="http://schemas.microsoft.com/office/drawing/2014/chartex" xmlns:cx1="http://schemas.microsoft.com/office/drawing/2015/9/8/chartex" xmlns:cx2="http://schemas.microsoft.com/office/drawing/2015/10/21/chartex" xmlns:cx3="http://schemas.microsoft.com/office/drawing/2016/5/9/chartex" xmlns:cx4="http://schemas.microsoft.com/office/drawing/2016/5/10/chartex" xmlns:cx5="http://schemas.microsoft.com/office/drawing/2016/5/11/chartex" xmlns:cx6="http://schemas.microsoft.com/office/drawing/2016/5/12/chartex" xmlns:cx7="http://schemas.microsoft.com/office/drawing/2016/5/13/chartex" xmlns:cx8="http://schemas.microsoft.com/office/drawing/2016/5/14/chartex" xmlns:mc="http://schemas.openxmlformats.org/markup-compatibility/2006" xmlns:aink="http://schemas.microsoft.com/office/drawing/2016/ink" xmlns:am3d="http://schemas.microsoft.com/office/drawing/2017/model3d" xmlns:o="urn:schemas-microsoft-com:office:office" xmlns:oel="http://schemas.microsoft.com/office/2019/extlst" xmlns:r="http://schemas.openxmlformats.org/officeDocument/2006/relationships" xmlns:m="http://schemas.openxmlformats.org/officeDocument/2006/math" xmlns:v="urn:schemas-microsoft-com:vml" xmlns:wp14="http://schemas.microsoft.com/office/word/2010/wordprocessingDrawing" xmlns:wp="http://schemas.openxmlformats.org/drawingml/2006/wordprocessingDrawing" xmlns:w10="urn:schemas-microsoft-com:office:word" xmlns:w="http://schemas.openxmlformats.org/wordprocessingml/2006/main" xmlns:w14="http://schemas.microsoft.com/office/word/2010/wordml" xmlns:w15="http://schemas.microsoft.com/office/word/2012/wordml" xmlns:w16cex="http://schemas.microsoft.com/office/word/2018/wordml/cex" xmlns:w16cid="http://schemas.microsoft.com/office/word/2016/wordml/cid" xmlns:w16="http://schemas.microsoft.com/office/word/2018/wordml" xmlns:w16du="http://schemas.microsoft.com/office/word/2023/wordml/word16du" xmlns:w16sdtdh="http://schemas.microsoft.com/office/word/2020/wordml/sdtdatahash" xmlns:w16se="http://schemas.microsoft.com/office/word/2015/wordml/symex" xmlns:wpg="http://schemas.microsoft.com/office/word/2010/wordprocessingGroup" xmlns:wpi="http://schemas.microsoft.com/office/word/2010/wordprocessingInk" xmlns:wne="http://schemas.microsoft.com/office/word/2006/wordml" xmlns:wps="http://schemas.microsoft.com/office/word/2010/wordprocessingShape" mc:Ignorable="w14 w15 w16se w16cid w16 w16cex w16sdtdh w16du wp14">
+<w:numbering xmlns:wpc="http://schemas.microsoft.com/office/word/2010/wordprocessingCanvas" xmlns:cx="http://schemas.microsoft.com/office/drawing/2014/chartex" xmlns:cx1="http://schemas.microsoft.com/office/drawing/2015/9/8/chartex" xmlns:cx2="http://schemas.microsoft.com/office/drawing/2015/10/21/chartex" xmlns:cx3="http://schemas.microsoft.com/office/drawing/2016/5/9/chartex" xmlns:cx4="http://schemas.microsoft.com/office/drawing/2016/5/10/chartex" xmlns:cx5="http://schemas.microsoft.com/office/drawing/2016/5/11/chartex" xmlns:cx6="http://schemas.microsoft.com/office/drawing/2016/5/12/chartex" xmlns:cx7="http://schemas.microsoft.com/office/drawing/2016/5/13/chartex" xmlns:cx8="http://schemas.microsoft.com/office/drawing/2016/5/14/chartex" xmlns:mc="http://schemas.openxmlformats.org/markup-compatibility/2006" xmlns:aink="http://schemas.microsoft.com/office/drawing/2016/ink" xmlns:am3d="http://schemas.microsoft.com/office/drawing/2017/model3d" xmlns:o="urn:schemas-microsoft-com:office:office" xmlns:oel="http://schemas.microsoft.com/office/2019/extlst" xmlns:r="http://schemas.openxmlformats.org/officeDocument/2006/relationships" xmlns:m="http://schemas.openxmlformats.org/officeDocument/2006/math" xmlns:v="urn:schemas-microsoft-com:vml" xmlns:wp14="http://schemas.microsoft.com/office/word/2010/wordprocessingDrawing" xmlns:wp="http://schemas.openxmlformats.org/drawingml/2006/wordprocessingDrawing" xmlns:w10="urn:schemas-microsoft-com:office:word" xmlns:w="http://schemas.openxmlformats.org/wordprocessingml/2006/main" xmlns:w14="http://schemas.microsoft.com/office/word/2010/wordml" xmlns:w15="http://schemas.microsoft.com/office/word/2012/wordml" xmlns:w16cex="http://schemas.microsoft.com/office/word/2018/wordml/cex" xmlns:w16cid="http://schemas.microsoft.com/office/word/2016/wordml/cid" xmlns:w16="http://schemas.microsoft.com/office/word/2018/wordml" xmlns:w16du="http://schemas.microsoft.com/office/word/2023/wordml/word16du" xmlns:w16sdtdh="http://schemas.microsoft.com/office/word/2020/wordml/sdtdatahash" xmlns:w16sdtfl="http://schemas.microsoft.com/office/word/2024/wordml/sdtformatlock" xmlns:w16se="http://schemas.microsoft.com/office/word/2015/wordml/symex" xmlns:wpg="http://schemas.microsoft.com/office/word/2010/wordprocessingGroup" xmlns:wpi="http://schemas.microsoft.com/office/word/2010/wordprocessingInk" xmlns:wne="http://schemas.microsoft.com/office/word/2006/wordml" xmlns:wps="http://schemas.microsoft.com/office/word/2010/wordprocessingShape" mc:Ignorable="w14 w15 w16se w16cid w16 w16cex w16sdtdh w16sdtfl w16du wp14">
   <w:abstractNum w:abstractNumId="0" w15:restartNumberingAfterBreak="0">
     <w:nsid w:val="17CF06DF"/>
     <w:multiLevelType w:val="hybridMultilevel"/>
@@ -1392,7 +1390,7 @@
 </file>
 
 <file path=word/styles.xml><?xml version="1.0" encoding="utf-8"?>
-<w:styles xmlns:mc="http://schemas.openxmlformats.org/markup-compatibility/2006" xmlns:r="http://schemas.openxmlformats.org/officeDocument/2006/relationships" xmlns:w="http://schemas.openxmlformats.org/wordprocessingml/2006/main" xmlns:w14="http://schemas.microsoft.com/office/word/2010/wordml" xmlns:w15="http://schemas.microsoft.com/office/word/2012/wordml" xmlns:w16cex="http://schemas.microsoft.com/office/word/2018/wordml/cex" xmlns:w16cid="http://schemas.microsoft.com/office/word/2016/wordml/cid" xmlns:w16="http://schemas.microsoft.com/office/word/2018/wordml" xmlns:w16du="http://schemas.microsoft.com/office/word/2023/wordml/word16du" xmlns:w16sdtdh="http://schemas.microsoft.com/office/word/2020/wordml/sdtdatahash" xmlns:w16se="http://schemas.microsoft.com/office/word/2015/wordml/symex" mc:Ignorable="w14 w15 w16se w16cid w16 w16cex w16sdtdh w16du">
+<w:styles xmlns:mc="http://schemas.openxmlformats.org/markup-compatibility/2006" xmlns:r="http://schemas.openxmlformats.org/officeDocument/2006/relationships" xmlns:w="http://schemas.openxmlformats.org/wordprocessingml/2006/main" xmlns:w14="http://schemas.microsoft.com/office/word/2010/wordml" xmlns:w15="http://schemas.microsoft.com/office/word/2012/wordml" xmlns:w16cex="http://schemas.microsoft.com/office/word/2018/wordml/cex" xmlns:w16cid="http://schemas.microsoft.com/office/word/2016/wordml/cid" xmlns:w16="http://schemas.microsoft.com/office/word/2018/wordml" xmlns:w16du="http://schemas.microsoft.com/office/word/2023/wordml/word16du" xmlns:w16sdtdh="http://schemas.microsoft.com/office/word/2020/wordml/sdtdatahash" xmlns:w16sdtfl="http://schemas.microsoft.com/office/word/2024/wordml/sdtformatlock" xmlns:w16se="http://schemas.microsoft.com/office/word/2015/wordml/symex" mc:Ignorable="w14 w15 w16se w16cid w16 w16cex w16sdtdh w16sdtfl w16du">
   <w:docDefaults>
     <w:rPrDefault>
       <w:rPr>

</xml_diff>